<commit_message>
made minor changes in conclusion section
</commit_message>
<xml_diff>
--- a/IEEE_RAG_FORMATTED.docx
+++ b/IEEE_RAG_FORMATTED.docx
@@ -1971,14 +1971,27 @@
                         <w:r>
                           <w:t xml:space="preserve">Figure </w:t>
                         </w:r>
-                        <w:fldSimple w:instr=" SEQ Figure \* ARABIC ">
-                          <w:r>
-                            <w:rPr>
-                              <w:noProof/>
-                            </w:rPr>
-                            <w:t>1</w:t>
-                          </w:r>
-                        </w:fldSimple>
+                        <w:r>
+                          <w:fldChar w:fldCharType="begin"/>
+                        </w:r>
+                        <w:r>
+                          <w:instrText xml:space="preserve"> SEQ Figure \* ARABIC </w:instrText>
+                        </w:r>
+                        <w:r>
+                          <w:fldChar w:fldCharType="separate"/>
+                        </w:r>
+                        <w:r>
+                          <w:rPr>
+                            <w:noProof/>
+                          </w:rPr>
+                          <w:t>1</w:t>
+                        </w:r>
+                        <w:r>
+                          <w:rPr>
+                            <w:noProof/>
+                          </w:rPr>
+                          <w:fldChar w:fldCharType="end"/>
+                        </w:r>
                         <w:r>
                           <w:t xml:space="preserve">. </w:t>
                         </w:r>
@@ -7431,14 +7444,27 @@
                         <w:r>
                           <w:t xml:space="preserve">Figure </w:t>
                         </w:r>
-                        <w:fldSimple w:instr=" SEQ Figure \* ARABIC ">
-                          <w:r>
-                            <w:rPr>
-                              <w:noProof/>
-                            </w:rPr>
-                            <w:t>2</w:t>
-                          </w:r>
-                        </w:fldSimple>
+                        <w:r>
+                          <w:fldChar w:fldCharType="begin"/>
+                        </w:r>
+                        <w:r>
+                          <w:instrText xml:space="preserve"> SEQ Figure \* ARABIC </w:instrText>
+                        </w:r>
+                        <w:r>
+                          <w:fldChar w:fldCharType="separate"/>
+                        </w:r>
+                        <w:r>
+                          <w:rPr>
+                            <w:noProof/>
+                          </w:rPr>
+                          <w:t>2</w:t>
+                        </w:r>
+                        <w:r>
+                          <w:rPr>
+                            <w:noProof/>
+                          </w:rPr>
+                          <w:fldChar w:fldCharType="end"/>
+                        </w:r>
                         <w:r>
                           <w:rPr>
                             <w:noProof/>
@@ -7513,14 +7539,27 @@
                         <w:r>
                           <w:t xml:space="preserve">Figure </w:t>
                         </w:r>
-                        <w:fldSimple w:instr=" SEQ Figure \* ARABIC ">
-                          <w:r>
-                            <w:rPr>
-                              <w:noProof/>
-                            </w:rPr>
-                            <w:t>3</w:t>
-                          </w:r>
-                        </w:fldSimple>
+                        <w:r>
+                          <w:fldChar w:fldCharType="begin"/>
+                        </w:r>
+                        <w:r>
+                          <w:instrText xml:space="preserve"> SEQ Figure \* ARABIC </w:instrText>
+                        </w:r>
+                        <w:r>
+                          <w:fldChar w:fldCharType="separate"/>
+                        </w:r>
+                        <w:r>
+                          <w:rPr>
+                            <w:noProof/>
+                          </w:rPr>
+                          <w:t>3</w:t>
+                        </w:r>
+                        <w:r>
+                          <w:rPr>
+                            <w:noProof/>
+                          </w:rPr>
+                          <w:fldChar w:fldCharType="end"/>
+                        </w:r>
                         <w:r>
                           <w:rPr>
                             <w:noProof/>
@@ -7812,14 +7851,27 @@
                         <w:r>
                           <w:t xml:space="preserve">Figure </w:t>
                         </w:r>
-                        <w:fldSimple w:instr=" SEQ Figure \* ARABIC ">
-                          <w:r>
-                            <w:rPr>
-                              <w:noProof/>
-                            </w:rPr>
-                            <w:t>4</w:t>
-                          </w:r>
-                        </w:fldSimple>
+                        <w:r>
+                          <w:fldChar w:fldCharType="begin"/>
+                        </w:r>
+                        <w:r>
+                          <w:instrText xml:space="preserve"> SEQ Figure \* ARABIC </w:instrText>
+                        </w:r>
+                        <w:r>
+                          <w:fldChar w:fldCharType="separate"/>
+                        </w:r>
+                        <w:r>
+                          <w:rPr>
+                            <w:noProof/>
+                          </w:rPr>
+                          <w:t>4</w:t>
+                        </w:r>
+                        <w:r>
+                          <w:rPr>
+                            <w:noProof/>
+                          </w:rPr>
+                          <w:fldChar w:fldCharType="end"/>
+                        </w:r>
                         <w:r>
                           <w:t xml:space="preserve">. Hallucination vs Prompt (All </w:t>
                         </w:r>
@@ -10727,14 +10779,27 @@
                         <w:r>
                           <w:t xml:space="preserve">Figure </w:t>
                         </w:r>
-                        <w:fldSimple w:instr=" SEQ Figure \* ARABIC ">
-                          <w:r>
-                            <w:rPr>
-                              <w:noProof/>
-                            </w:rPr>
-                            <w:t>5</w:t>
-                          </w:r>
-                        </w:fldSimple>
+                        <w:r>
+                          <w:fldChar w:fldCharType="begin"/>
+                        </w:r>
+                        <w:r>
+                          <w:instrText xml:space="preserve"> SEQ Figure \* ARABIC </w:instrText>
+                        </w:r>
+                        <w:r>
+                          <w:fldChar w:fldCharType="separate"/>
+                        </w:r>
+                        <w:r>
+                          <w:rPr>
+                            <w:noProof/>
+                          </w:rPr>
+                          <w:t>5</w:t>
+                        </w:r>
+                        <w:r>
+                          <w:rPr>
+                            <w:noProof/>
+                          </w:rPr>
+                          <w:fldChar w:fldCharType="end"/>
+                        </w:r>
                         <w:r>
                           <w:rPr>
                             <w:noProof/>
@@ -10913,14 +10978,27 @@
       <w:r>
         <w:t xml:space="preserve">Figure </w:t>
       </w:r>
-      <w:fldSimple w:instr=" SEQ Figure \* ARABIC ">
-        <w:r>
-          <w:rPr>
-            <w:noProof/>
-          </w:rPr>
-          <w:t>6</w:t>
-        </w:r>
-      </w:fldSimple>
+      <w:r>
+        <w:fldChar w:fldCharType="begin"/>
+      </w:r>
+      <w:r>
+        <w:instrText xml:space="preserve"> SEQ Figure \* ARABIC </w:instrText>
+      </w:r>
+      <w:r>
+        <w:fldChar w:fldCharType="separate"/>
+      </w:r>
+      <w:r>
+        <w:rPr>
+          <w:noProof/>
+        </w:rPr>
+        <w:t>6</w:t>
+      </w:r>
+      <w:r>
+        <w:rPr>
+          <w:noProof/>
+        </w:rPr>
+        <w:fldChar w:fldCharType="end"/>
+      </w:r>
       <w:r>
         <w:rPr>
           <w:noProof/>
@@ -15635,14 +15713,27 @@
       <w:r>
         <w:t xml:space="preserve">Figure </w:t>
       </w:r>
-      <w:fldSimple w:instr=" SEQ Figure \* ARABIC ">
-        <w:r>
-          <w:rPr>
-            <w:noProof/>
-          </w:rPr>
-          <w:t>7</w:t>
-        </w:r>
-      </w:fldSimple>
+      <w:r>
+        <w:fldChar w:fldCharType="begin"/>
+      </w:r>
+      <w:r>
+        <w:instrText xml:space="preserve"> SEQ Figure \* ARABIC </w:instrText>
+      </w:r>
+      <w:r>
+        <w:fldChar w:fldCharType="separate"/>
+      </w:r>
+      <w:r>
+        <w:rPr>
+          <w:noProof/>
+        </w:rPr>
+        <w:t>7</w:t>
+      </w:r>
+      <w:r>
+        <w:rPr>
+          <w:noProof/>
+        </w:rPr>
+        <w:fldChar w:fldCharType="end"/>
+      </w:r>
       <w:r>
         <w:t>. Full configuration performance range</w:t>
       </w:r>
@@ -15702,14 +15793,27 @@
                         <w:r>
                           <w:t xml:space="preserve">Figure </w:t>
                         </w:r>
-                        <w:fldSimple w:instr=" SEQ Figure \* ARABIC ">
-                          <w:r>
-                            <w:rPr>
-                              <w:noProof/>
-                            </w:rPr>
-                            <w:t>8</w:t>
-                          </w:r>
-                        </w:fldSimple>
+                        <w:r>
+                          <w:fldChar w:fldCharType="begin"/>
+                        </w:r>
+                        <w:r>
+                          <w:instrText xml:space="preserve"> SEQ Figure \* ARABIC </w:instrText>
+                        </w:r>
+                        <w:r>
+                          <w:fldChar w:fldCharType="separate"/>
+                        </w:r>
+                        <w:r>
+                          <w:rPr>
+                            <w:noProof/>
+                          </w:rPr>
+                          <w:t>8</w:t>
+                        </w:r>
+                        <w:r>
+                          <w:rPr>
+                            <w:noProof/>
+                          </w:rPr>
+                          <w:fldChar w:fldCharType="end"/>
+                        </w:r>
                         <w:r>
                           <w:t>. Noise Injection – F1 vs hallucination rate (Gemma 3:12b only)</w:t>
                         </w:r>
@@ -16048,15 +16152,7 @@
           <w:sz w:val="20"/>
           <w:szCs w:val="20"/>
         </w:rPr>
-        <w:t xml:space="preserve">The authors conducted experiments on 36 core and 324 extended RAGs. F1 for 256 tokens is 4.7%–6.9% smaller than for 128 tokens (4.7–6.9%). k = 3–5 is the depth of retrieval; cross-encoder reranking does not seem to improve this F1 at low k; baseline prompts raise the maximum level of F1 for tokens, but strict prompts lower hallucination levels; noise injection with strict prompts unexpectedly increases F1 to 0.748, the maximum F1 in the study; Gemma 3:12b </w:t>
-      </w:r>
-      <w:r>
-        <w:rPr>
-          <w:sz w:val="20"/>
-          <w:szCs w:val="20"/>
-        </w:rPr>
-        <w:lastRenderedPageBreak/>
-        <w:t>outperforms LLaMA 3.2:3b in the pilot study, suggesting that scale is important in extractive RAG performance.</w:t>
+        <w:t>36 core and 324 extended RAGs were used for experiments. F1 for 256 tokens is 4.7%–6.9% smaller than for 128 tokens (4.7–6.9%). k = 3–5 is the depth of retrieval. Cross-encoder reranking seems to improve this F1 at low k; standard prompts increase the maximum level of F1 for tokens, but strict prompts lower the hallucination level; random noise injection with strict prompts unexpectedly increases F1 to 0.748, the maximum F1 in the study; Gemma 3:12b outperformed LLaMA 3.2:3b in the pilot study, suggesting that scale is an important aspect of extractive RAG performance.</w:t>
       </w:r>
     </w:p>
     <w:p>
@@ -16091,7 +16187,7 @@
           <w:sz w:val="20"/>
           <w:szCs w:val="20"/>
         </w:rPr>
-        <w:t>Further work will add to the framework the full set of SQuAD validations and multi-domain benchmarks (TriviaQA, Natural Questions, HotpotQA); evaluation of 7B-70B parameter models to study scale interaction with retrieval depth; consideration of semantic similarity and LLM-as-a-judge faithfulness scores; exploratory exploration of semantic and recursive chunking in place of fixed-size chunking; and investigation of adaptive retrieval policies that change k based on query complexity and retrieval confidence.</w:t>
+        <w:t>The proposed framework will also be extended to include the full suite of SQuAD validations and multi-domain benchmarks (TriviaQA, Natural Questions, HotpotQA); evaluation of the 7B-70B parameter models to investigate the relationship between scale and depth of retrieval; consideration of semantic similarity and LLM-as-a-judge faithfulness scores; exploration of semantic and recursive chunking as an alternative to fixed-size chunking; and assessment of adaptive retrieval policies that change k according query complexity and retrieval confidence.</w:t>
       </w:r>
     </w:p>
     <w:p>
@@ -20302,7 +20398,7 @@
 </file>
 
 <file path=customXml/itemProps1.xml><?xml version="1.0" encoding="utf-8"?>
-<ds:datastoreItem xmlns:ds="http://purl.oclc.org/ooxml/officeDocument/customXml" ds:itemID="{F96F6E09-4F42-4418-A077-49DB4CCC8BB0}">
+<ds:datastoreItem xmlns:ds="http://purl.oclc.org/ooxml/officeDocument/customXml" ds:itemID="{9154F8E3-32DD-4E8F-9140-D50BB6102E32}">
   <ds:schemaRefs>
     <ds:schemaRef ds:uri="http://schemas.openxmlformats.org/officeDocument/2006/bibliography"/>
   </ds:schemaRefs>

</xml_diff>